<commit_message>
Fix: correct all docs to domestic-international travel agency. Bond 200M to 100M, monthly fixed 1.58M to 1.54M, capital min clarified 50M statutory vs 100M actual
</commit_message>
<xml_diff>
--- a/files/Resonate_Club_CEO_F4_Action_Plan_KO.docx
+++ b/files/Resonate_Club_CEO_F4_Action_Plan_KO.docx
@@ -1234,7 +1234,7 @@
     </w:p>
     <w:p>
       <w:r>
-        <w:t>국내외여행업 + 기획여행(패키지) 기준 보증금액: 2억원</w:t>
+        <w:t>국내외여행업 + 기획여행(패키지) 기준 보증금액: 1억원</w:t>
       </w:r>
     </w:p>
     <w:p>
@@ -1262,11 +1262,11 @@
         <w:br/>
         <w:t xml:space="preserve">   - 방식 A: 전액 지급보증 (예치금 0원, 연 보험료 0.5~1.5%)</w:t>
         <w:br/>
-        <w:t xml:space="preserve">     → 2억원 × 0.5~1% = 연 100~300만원</w:t>
+        <w:t xml:space="preserve">     → 1억원 × 0.5~1% = 연 50~100만원</w:t>
         <w:br/>
         <w:t xml:space="preserve">   - 방식 B: 부분예치 + 지급보증 (심사 통과 어려울 시)</w:t>
         <w:br/>
-        <w:t xml:space="preserve">     → 예: 4,000만원 예치 + 1.6억원 지급보증</w:t>
+        <w:t xml:space="preserve">     → 예: 2,000만원 예치 + 8,000만원 지급보증</w:t>
       </w:r>
     </w:p>
     <w:p>

</xml_diff>

<commit_message>
Fix guarantee insurance to correct legal amounts: base 30M + planned travel 200M = 230M total per Tourism Act Schedule 3. Add insurance explanation section. Update monthly fixed from 1.54M to 1.69M, total liquidity from 125M to 130M.
</commit_message>
<xml_diff>
--- a/files/Resonate_Club_CEO_F4_Action_Plan_KO.docx
+++ b/files/Resonate_Club_CEO_F4_Action_Plan_KO.docx
@@ -1234,7 +1234,19 @@
     </w:p>
     <w:p>
       <w:r>
-        <w:t>국내외여행업 + 기획여행(패키지) 기준 보증금액: 1억원</w:t>
+        <w:t>국내외여행업 + 기획여행(패키지) 기준 보증금액: 총 2억 3,000만원</w:t>
+        <w:br/>
+        <w:t xml:space="preserve">  → 기본 보증: 3,000만원 (국내외여행업)</w:t>
+        <w:br/>
+        <w:t xml:space="preserve">  → 기획여행 추가 보증: 2억원 (관광진흥법 시행규칙 별표3 — 기본보증 '외에 추가로' 가입)</w:t>
+      </w:r>
+    </w:p>
+    <w:p>
+      <w:r>
+        <w:rPr>
+          <w:color w:val="CC0000"/>
+        </w:rPr>
+        <w:t>⚠️ 법령 근거: 관광진흥법 시행규칙 [별표 3] 비고 — '국내외여행업 또는 종합여행업을 하는 여행업자 중에서 기획여행을 실시하려는 자는 해당 업종에 따른 보증보험등에 가입하고 유지하는 것 외에 추가로 기획여행에 따른 보증보험등에 가입하여야 한다.'</w:t>
       </w:r>
     </w:p>
     <w:p>
@@ -1262,11 +1274,11 @@
         <w:br/>
         <w:t xml:space="preserve">   - 방식 A: 전액 지급보증 (예치금 0원, 연 보험료 0.5~1.5%)</w:t>
         <w:br/>
-        <w:t xml:space="preserve">     → 1억원 × 0.5~1% = 연 50~100만원</w:t>
+        <w:t xml:space="preserve">     → 2.3억원 × 1% = 연 약 230만원 (월 약 19만원)</w:t>
         <w:br/>
         <w:t xml:space="preserve">   - 방식 B: 부분예치 + 지급보증 (심사 통과 어려울 시)</w:t>
         <w:br/>
-        <w:t xml:space="preserve">     → 예: 2,000만원 예치 + 8,000만원 지급보증</w:t>
+        <w:t xml:space="preserve">     → 예: 5,000만원 예치 + 1.8억원 지급보증</w:t>
       </w:r>
     </w:p>
     <w:p>
@@ -1279,7 +1291,7 @@
         <w:rPr>
           <w:b/>
         </w:rPr>
-        <w:t>☑️ 확보: 영업보증보험 증권 (구청 등록 제출용)</w:t>
+        <w:t>☑️ 확보: 영업보증보험 증권 2건 (기본 + 기획여행 추가, 구청 등록 제출용)</w:t>
       </w:r>
     </w:p>
     <w:p>

</xml_diff>

<commit_message>
Final: Doc2 KO+EN and Doc3 KO+EN with consistent numbers from Doc1 (230M insurance, 1,727K monthly, 192K+35K premiums). Doc1 is authoritative.
</commit_message>
<xml_diff>
--- a/files/Resonate_Club_CEO_F4_Action_Plan_KO.docx
+++ b/files/Resonate_Club_CEO_F4_Action_Plan_KO.docx
@@ -42,9 +42,9 @@
         </w:rPr>
         <w:t>작성일: 2026년 6월 11일</w:t>
         <w:br/>
-        <w:t>대표이사: 이희성 (F-4 재외동포 비자)</w:t>
+        <w:t>대표이사: 이희성 (F-4 Overseas Korean Visa)</w:t>
         <w:br/>
-        <w:t>투자자: 미국인 (D-8-1 예정, 지분 90%)</w:t>
+        <w:t>투자자: U.S. Investor (D-8-1, 90% Equity Stake)</w:t>
       </w:r>
     </w:p>
     <w:p>
@@ -70,17 +70,23 @@
         <w:br/>
         <w:t>핵심 전제:</w:t>
         <w:br/>
-        <w:t>• 투자자: 미국인, 자본금 9,000만원 출자 (지분 90%), D-8-1 비자 취득 예정</w:t>
+        <w:t>• 투자자: 미국인, 자본금 90,000,000원 출자 (지분 90%), D-8-1 비자 취득 예정</w:t>
         <w:br/>
-        <w:t>• 대표이사: 이희성, F-4 비자, 자본금 1,000만원 출자 (지분 10%)</w:t>
+        <w:t>• 대표이사: 이희성, F-4 비자, 자본금 10,000,000원 출자 (지분 10%)</w:t>
         <w:br/>
         <w:t>• 법인형태: 외국인투자기업 주식회사 (FIPA 적용)</w:t>
         <w:br/>
-        <w:t>• 사업유형: 국내외여행업 (기획여행사)</w:t>
+        <w:t>• 사업유형: 국내외여행업 (기획여행사 / Planned Travel Operator)</w:t>
         <w:br/>
         <w:t>• 소재지: 부산광역시 해운대구</w:t>
         <w:br/>
-        <w:t>• 목표: 8월 중순까지 여행업 등록 완료 → 9월부터 영업 개시</w:t>
+        <w:t>• 자본금: 총 100,000,000원 (법정 최소 50,000,000원 상회)</w:t>
+        <w:br/>
+        <w:t>• 영업보증보험: 230,000,000원 (기본 30,000,000원 + 기획여행 추가 200,000,000원)</w:t>
+        <w:br/>
+        <w:t>• 월고정비: ₩1,727,000 (보증보험 ₩192,000 + 배상책임보험 ₩35,000 포함)</w:t>
+        <w:br/>
+        <w:t>• 목표: 8월 중순까지 법인설립 완료 → 9월 중순 여행업 등록 완료 → 9월 말 영업 개시</w:t>
       </w:r>
     </w:p>
     <w:p>
@@ -769,7 +775,7 @@
         <w:br/>
         <w:t xml:space="preserve">   - 지분 비율: 투자자 90% / CEO 10%</w:t>
         <w:br/>
-        <w:t xml:space="preserve">   - 자본금: 총 1억원 (투자자 9,000만원, CEO 1,000만원)</w:t>
+        <w:t xml:space="preserve">   - 자본금: 총 100,000,000원 (투자자 90,000,000원, CEO 10,000,000원)</w:t>
         <w:br/>
         <w:t xml:space="preserve">   - 대표이사: 이희성 / 이사(또는 감사): 투자자</w:t>
         <w:br/>
@@ -841,26 +847,14 @@
         <w:br/>
         <w:t xml:space="preserve">   - 사전 확보한 매물 리스트 중심으로 2~3곳 실사</w:t>
         <w:br/>
-        <w:t xml:space="preserve">   - 필수 요건:</w:t>
+        <w:t xml:space="preserve">   - 필수 요건: 실제 사무공간 (가상오피스 불가), 해운대구 관할, 확정일자 가능한 정식 임대차계약</w:t>
         <w:br/>
-        <w:t xml:space="preserve">     · 실제 사무공간 (가상오피스 불가 — 여행업/비자 심사에서 거절)</w:t>
-        <w:br/>
-        <w:t xml:space="preserve">     · 해운대구 관할 내 위치</w:t>
-        <w:br/>
-        <w:t xml:space="preserve">     · 확정일자 받을 수 있는 정식 임대차계약</w:t>
-        <w:br/>
-        <w:t xml:space="preserve">   - 예상 보증금: 500~1,000만원</w:t>
-        <w:br/>
-        <w:t xml:space="preserve">   - 예상 월세: 50~80만원</w:t>
+        <w:t xml:space="preserve">   - 예상 보증금: 500~1,000만원 / 예상 월세: 50~80만원</w:t>
       </w:r>
     </w:p>
     <w:p>
       <w:r>
         <w:t>3. 임대차 계약 체결 (7월 19~20일)</w:t>
-        <w:br/>
-        <w:t xml:space="preserve">   - 계약서 작성 + 확정일자 수령</w:t>
-        <w:br/>
-        <w:t xml:space="preserve">   - 전입신고는 대표이사 주소지로 (사무실 ≠ 주거)</w:t>
       </w:r>
     </w:p>
     <w:p>
@@ -868,7 +862,7 @@
         <w:rPr>
           <w:b/>
         </w:rPr>
-        <w:t>☑️ 확보해야 할 서류: 임대차계약서 사본, 확정일자, 사업장 도면</w:t>
+        <w:t>☑️ 확보: 임대차계약서 사본, 확정일자, 사업장 도면</w:t>
       </w:r>
     </w:p>
     <w:p>
@@ -889,34 +883,24 @@
     </w:p>
     <w:p>
       <w:r>
-        <w:t>1. 정관 작성</w:t>
+        <w:t>1. 정관 작성 (법무사 또는 startbiz.go.kr)</w:t>
         <w:br/>
-        <w:t xml:space="preserve">   - 법무사 사무실 방문 또는 startbiz.go.kr 온라인 작성</w:t>
+        <w:t xml:space="preserve">   - 상호: 리조네이트 클럽 주식회사 (Resonate Club Inc.)</w:t>
         <w:br/>
-        <w:t xml:space="preserve">   - 필수 기재 사항:</w:t>
+        <w:t xml:space="preserve">   - 목적: 국내외여행업, 여행 알선, 관광 컨설팅 등</w:t>
         <w:br/>
-        <w:t xml:space="preserve">     · 상호: 리조네이트 클럽 주식회사 (영문: Resonate Club Inc.)</w:t>
+        <w:t xml:space="preserve">   - 본점: 부산광역시 해운대구</w:t>
         <w:br/>
-        <w:t xml:space="preserve">     · 목적: 국내외여행업, 여행 알선, 관광 컨설팅 등</w:t>
+        <w:t xml:space="preserve">   - 자본금: 100,000,000원 (보통주 2,000주, 1주당 ₩50,000)</w:t>
         <w:br/>
-        <w:t xml:space="preserve">     · 본점: 부산광역시 해운대구 [주소]</w:t>
+        <w:t xml:space="preserve">   - 발기인: 이희성 + [투자자명]</w:t>
         <w:br/>
-        <w:t xml:space="preserve">     · 자본금: 1억원 (보통주 2,000주, 1주당 5만원)</w:t>
-        <w:br/>
-        <w:t xml:space="preserve">     · 발기인: 이희성 + [투자자명] (공동발기 또는 투자자 위임)</w:t>
-        <w:br/>
-        <w:t xml:space="preserve">     · 임원: 대표이사 1인, 이사(또는 감사) 1인</w:t>
+        <w:t xml:space="preserve">   - 임원: 대표이사 1인, 이사(또는 감사) 1인</w:t>
       </w:r>
     </w:p>
     <w:p>
       <w:r>
-        <w:t>2. 공증</w:t>
-        <w:br/>
-        <w:t xml:space="preserve">   - 부산지방법원 동부지원 인근 공증사무소</w:t>
-        <w:br/>
-        <w:t xml:space="preserve">   - 정관 + 발기인 인감증명서 준비</w:t>
-        <w:br/>
-        <w:t xml:space="preserve">   - 비용: 약 10~15만원</w:t>
+        <w:t>2. 공증: 부산지방법원 동부지원 인근 공증사무소 (비용 약 10~15만원)</w:t>
       </w:r>
     </w:p>
     <w:p>
@@ -948,9 +932,7 @@
         <w:rPr>
           <w:color w:val="CC0000"/>
         </w:rPr>
-        <w:t>⚠️ 중요: 반드시 외국인투자신고를 먼저 한 후, 자본금을 입금해야 합니다.</w:t>
-        <w:br/>
-        <w:t>순서가 바뀌면 과태료 및 세제혜택 상실 위험이 있습니다.</w:t>
+        <w:t>⚠️ 중요: 반드시 외국인투자신고를 먼저 한 후 자본금을 입금해야 합니다. 순서가 바뀌면 과태료 및 세제혜택 상실 위험.</w:t>
       </w:r>
     </w:p>
     <w:p>
@@ -959,48 +941,30 @@
         <w:br/>
         <w:t xml:space="preserve">   - 신고처: KOTRA 외국인투자종합상담센터 또는 외환은행 본점</w:t>
         <w:br/>
-        <w:t xml:space="preserve">   - 제출 서류:</w:t>
+        <w:t xml:space="preserve">   - 제출: 외국인투자신고서, 투자자 여권 사본, 주소 증명, 사업계획서, 정관 공증본</w:t>
         <w:br/>
-        <w:t xml:space="preserve">     · 외국인투자신고서 (KOTRA 양식)</w:t>
-        <w:br/>
-        <w:t xml:space="preserve">     · 투자자 여권 사본</w:t>
-        <w:br/>
-        <w:t xml:space="preserve">     · 투자자 주소 증명서류</w:t>
-        <w:br/>
-        <w:t xml:space="preserve">     · 사업계획서</w:t>
-        <w:br/>
-        <w:t xml:space="preserve">     · 정관 (공증본)</w:t>
-        <w:br/>
-        <w:t xml:space="preserve">   - 처리 기간: 통상 1~2일 (현장 접수 시)</w:t>
+        <w:t xml:space="preserve">   - 처리 기간: 통상 1~2일</w:t>
       </w:r>
     </w:p>
     <w:p>
       <w:r>
-        <w:t>2. 자본금 계좌 개설 (7월 25~26일)</w:t>
-        <w:br/>
-        <w:t xml:space="preserve">   - 외환은행 또는 국민은행 '외국인투자 전용 계좌' 개설</w:t>
-        <w:br/>
-        <w:t xml:space="preserve">   - 법인설립 전이므로 '발기인 명의의 자본금 납입 보관계좌'</w:t>
+        <w:t>2. 자본금 계좌 개설 (7월 25~26일): 외환은행 또는 국민은행 '외국인투자 전용 계좌'</w:t>
       </w:r>
     </w:p>
     <w:p>
       <w:r>
         <w:t>3. 자본금 입금 (7월 27~28일)</w:t>
         <w:br/>
-        <w:t xml:space="preserve">   - 투자자: $67,000 → 원화 환전 후 9,000만원 입금</w:t>
+        <w:t xml:space="preserve">   - 투자자: 90,000,000원 입금</w:t>
         <w:br/>
-        <w:t xml:space="preserve">   - CEO: 1,000만원 입금</w:t>
+        <w:t xml:space="preserve">   - CEO: 10,000,000원 입금</w:t>
         <w:br/>
         <w:t xml:space="preserve">   - 은행에서 '주식납입금 보관증명서' 발급</w:t>
       </w:r>
     </w:p>
     <w:p>
       <w:r>
-        <w:t>4. 외국인투자기업 등록 (7월 29~30일)</w:t>
-        <w:br/>
-        <w:t xml:space="preserve">   - 자본금 입금 확인 후 KOTRA/은행에서 등록증 발급</w:t>
-        <w:br/>
-        <w:t xml:space="preserve">   - 외국인투자기업등록증명서 수령 (D-8 비자 신청 필수 서류)</w:t>
+        <w:t>4. 외국인투자기업 등록 (7월 29~30일): KOTRA/은행에서 등록증 발급</w:t>
       </w:r>
     </w:p>
     <w:p>
@@ -1024,7 +988,7 @@
     </w:p>
     <w:p>
       <w:r>
-        <w:t>소요 기간: 관할 등기소 접수 후 5~7일</w:t>
+        <w:t>소요 기간: 5~7일</w:t>
       </w:r>
     </w:p>
     <w:p>
@@ -1033,41 +997,17 @@
         <w:br/>
         <w:t xml:space="preserve">   - 법무사에게 서류 일임 추천 (패키지 50~80만원)</w:t>
         <w:br/>
-        <w:t xml:space="preserve">   - 필요 서류:</w:t>
-        <w:br/>
-        <w:t xml:space="preserve">     · 정관 (공증본)</w:t>
-        <w:br/>
-        <w:t xml:space="preserve">     · 발기인 인감증명서 + 주민등록등본</w:t>
-        <w:br/>
-        <w:t xml:space="preserve">     · 주식납입금 보관증명서</w:t>
-        <w:br/>
-        <w:t xml:space="preserve">     · 대표이사 취임승낙서</w:t>
-        <w:br/>
-        <w:t xml:space="preserve">     · 이사(감사) 취임승낙서 (투자자)</w:t>
-        <w:br/>
-        <w:t xml:space="preserve">     · 등기신청서 + 등록면허세</w:t>
+        <w:t xml:space="preserve">   - 필요 서류: 정관 공증본, 발기인 인감증명서+주민등록등본, 주식납입금 보관증명서, 대표이사 취임승낙서, 이사 취임승낙서, 등기신청서+등록면허세</w:t>
       </w:r>
     </w:p>
     <w:p>
       <w:r>
-        <w:t>2. 등기소 접수 (8월 1~3일)</w:t>
-        <w:br/>
-        <w:t xml:space="preserve">   - 부산지방법원 동부지원 등기과 방문</w:t>
-        <w:br/>
-        <w:t xml:space="preserve">   - 또는 전자등기시스템(iros.go.kr) 이용</w:t>
-        <w:br/>
-        <w:t xml:space="preserve">   - 접수 후 처리 기간: 5~7일</w:t>
+        <w:t>2. 등기소 접수 (8월 1~3일): 부산지방법원 동부지원 등기과 또는 iros.go.kr 전자등기</w:t>
       </w:r>
     </w:p>
     <w:p>
       <w:r>
-        <w:t>3. 등기완료 확인 (8월 6일 전후)</w:t>
-        <w:br/>
-        <w:t xml:space="preserve">   - 법인등기부등본 발급 (인터넷등기소에서 즉시 가능)</w:t>
-        <w:br/>
-        <w:t xml:space="preserve">   - 법인 인감카드 발급</w:t>
-        <w:br/>
-        <w:t xml:space="preserve">   - 법인 통장 개설 (은행 방문, 법인등기부등본 + 법인인감 필요)</w:t>
+        <w:t>3. 등기완료 확인 (8월 6일 전후): 법인등기부등본 발급, 법인 인감카드, 법인 통장 개설</w:t>
       </w:r>
     </w:p>
     <w:p>
@@ -1091,37 +1031,21 @@
     </w:p>
     <w:p>
       <w:r>
-        <w:t>소요 기간: 세무서 접수 후 3~5일</w:t>
+        <w:t>소요 기간: 3~5일</w:t>
       </w:r>
     </w:p>
     <w:p>
       <w:r>
-        <w:t>1. 사업자등록 신청 (8월 7~8일)</w:t>
+        <w:t>1. 사업자등록 신청 (8월 7~8일): 해운대세무서 방문 또는 hometax.go.kr 온라인</w:t>
         <w:br/>
-        <w:t xml:space="preserve">   - 해운대세무서 방문 또는 홈택스(hometax.go.kr) 온라인 신청</w:t>
-        <w:br/>
-        <w:t xml:space="preserve">   - 필요 서류:</w:t>
-        <w:br/>
-        <w:t xml:space="preserve">     · 법인등기부등본</w:t>
-        <w:br/>
-        <w:t xml:space="preserve">     · 임대차계약서 사본</w:t>
-        <w:br/>
-        <w:t xml:space="preserve">     · 정관 사본</w:t>
-        <w:br/>
-        <w:t xml:space="preserve">     · 법인인감증명서</w:t>
-        <w:br/>
-        <w:t xml:space="preserve">     · 대표이사 신분증</w:t>
+        <w:t xml:space="preserve">   - 필요 서류: 법인등기부등본, 임대차계약서 사본, 정관 사본, 법인인감증명서, 대표이사 신분증</w:t>
       </w:r>
     </w:p>
     <w:p>
       <w:r>
         <w:t>2. 사업자등록증 수령 (8월 11일 전후)</w:t>
         <w:br/>
-        <w:t xml:space="preserve">   - 업종: 여행사업 (관광진흥법) / 관광여행사</w:t>
-        <w:br/>
-        <w:t xml:space="preserve">   - 과세유형: 일반과세자</w:t>
-        <w:br/>
-        <w:t xml:space="preserve">   - 통상 3~5일 이내 발급 (온라인 시 더 빠름)</w:t>
+        <w:t xml:space="preserve">   - 업종: 여행사업 (관광진흥법) / 관광여행사 / 일반과세자</w:t>
       </w:r>
     </w:p>
     <w:p>
@@ -1145,7 +1069,7 @@
     </w:p>
     <w:p>
       <w:r>
-        <w:t>소요 기간: 구청 접수 후 2~4주 (구청 및 한국관광공사 심사)</w:t>
+        <w:t>소요 기간: 2~4주 (구청 및 한국관광공사 심사)</w:t>
       </w:r>
     </w:p>
     <w:p>
@@ -1153,54 +1077,24 @@
         <w:rPr>
           <w:color w:val="CC0000"/>
         </w:rPr>
-        <w:t>⚠️ 중요: 이 단계가 가장 긴 리드타임입니다. 서류 누락 시 반려되면 다시 2~4주입니다.</w:t>
+        <w:t>⚠️ 중요: 가장 긴 리드타임. 서류 누락 시 반려 → 재심사 2~4주 추가.</w:t>
       </w:r>
     </w:p>
     <w:p>
       <w:r>
         <w:t>1. 구청 제출 서류 준비 (8월 12~14일)</w:t>
         <w:br/>
-        <w:t xml:space="preserve">   - 관광진흥법 시행규칙 제9조 서식:</w:t>
-        <w:br/>
-        <w:t xml:space="preserve">     · 여행업 등록신청서</w:t>
-        <w:br/>
-        <w:t xml:space="preserve">     · 사업계획서 (첨부 양식) — 아래 내용 포함 필수:</w:t>
-        <w:br/>
-        <w:t xml:space="preserve">       → 법인 개요, 사업 비전, 마케팅 전략, 재무 계획</w:t>
-        <w:br/>
-        <w:t xml:space="preserve">       → 취급 상품: 한국→미국 프리미엄 골프 투어</w:t>
-        <w:br/>
-        <w:t xml:space="preserve">       → 시장분석, 경쟁력 분석, 리스크 관리 방안</w:t>
-        <w:br/>
-        <w:t xml:space="preserve">     · 법인등기부등본</w:t>
-        <w:br/>
-        <w:t xml:space="preserve">     · 사업자등록증 사본</w:t>
-        <w:br/>
-        <w:t xml:space="preserve">     · 임대차계약서 사본</w:t>
-        <w:br/>
-        <w:t xml:space="preserve">     · 자본금 증명 서류</w:t>
-        <w:br/>
-        <w:t xml:space="preserve">     · 영업보증보험 가입 증명서 (동시 진행 가능)</w:t>
-        <w:br/>
-        <w:t xml:space="preserve">     · 국외여행 인솔자 자격증 사본 (또는 채용계획서)</w:t>
-        <w:br/>
-        <w:t xml:space="preserve">     · 수수료: 5만원 (수입증지)</w:t>
+        <w:t xml:space="preserve">   - 관광진흥법 시행규칙 제9조 서식: 여행업 등록신청서, 사업계획서, 법인등기부등본, 사업자등록증 사본, 임대차계약서 사본, 자본금 증명, 영업보증보험 가입 증명서, 국외여행 인솔자 자격증 사본, 수수료 5만원</w:t>
       </w:r>
     </w:p>
     <w:p>
       <w:r>
-        <w:t>2. 해운대구청 접수 (8월 14~18일)</w:t>
-        <w:br/>
-        <w:t xml:space="preserve">   - 관광과/문화관광과 방문</w:t>
+        <w:t>2. 해운대구청 접수 (8월 14~18일): 관광과/문화관광과 방문</w:t>
       </w:r>
     </w:p>
     <w:p>
       <w:r>
-        <w:t>3. 심사 기간 (2~4주)</w:t>
-        <w:br/>
-        <w:t xml:space="preserve">   - 구청 1차 심사 → 필요 시 한국관광공사 기술 검토</w:t>
-        <w:br/>
-        <w:t xml:space="preserve">   - 추가 서류 요청 가능성 대비</w:t>
+        <w:t>3. 심사 기간 (2~4주): 구청 1차 심사 → 필요 시 한국관광공사 기술 검토</w:t>
       </w:r>
     </w:p>
     <w:p>
@@ -1234,11 +1128,13 @@
     </w:p>
     <w:p>
       <w:r>
-        <w:t>국내외여행업 + 기획여행(패키지) 기준 보증금액: 총 2억 3,000만원</w:t>
+        <w:t>국내외여행업 + 기획여행(패키지) 기준 보증금액: 총 230,000,000원</w:t>
         <w:br/>
-        <w:t xml:space="preserve">  → 기본 보증: 3,000만원 (국내외여행업)</w:t>
+        <w:t xml:space="preserve">  → 기본 보증: 30,000,000원 (국내외여행업)</w:t>
         <w:br/>
-        <w:t xml:space="preserve">  → 기획여행 추가 보증: 2억원 (관광진흥법 시행규칙 별표3 — 기본보증 '외에 추가로' 가입)</w:t>
+        <w:t xml:space="preserve">  → 기획여행 추가 보증: 200,000,000원</w:t>
+        <w:br/>
+        <w:t xml:space="preserve">     (관광진흥법 시행규칙 별표3 비고 — 기본보증 외에 추가로 가입)</w:t>
       </w:r>
     </w:p>
     <w:p>
@@ -1246,26 +1142,16 @@
         <w:rPr>
           <w:color w:val="CC0000"/>
         </w:rPr>
-        <w:t>⚠️ 법령 근거: 관광진흥법 시행규칙 [별표 3] 비고 — '국내외여행업 또는 종합여행업을 하는 여행업자 중에서 기획여행을 실시하려는 자는 해당 업종에 따른 보증보험등에 가입하고 유지하는 것 외에 추가로 기획여행에 따른 보증보험등에 가입하여야 한다.'</w:t>
+        <w:t>⚠️ 법령 근거: '국내외여행업 또는 종합여행업을 하는 여행업자 중에서 기획여행을 실시하려는 자는 해당 업종에 따른 보증보험등에 가입하고 유지하는 것 외에 추가로 기획여행에 따른 보증보험등에 가입하여야 한다.'</w:t>
       </w:r>
     </w:p>
     <w:p>
       <w:r>
         <w:t>1. 서울보증보험(SGI) 상담 예약 (8월 12일)</w:t>
         <w:br/>
-        <w:t xml:space="preserve">   - 부산지점: 부산광역시 연제구 법원로 소재</w:t>
+        <w:t xml:space="preserve">   - 부산지점: 부산광역시 연제구 법원로</w:t>
         <w:br/>
-        <w:t xml:space="preserve">   - 필요 서류:</w:t>
-        <w:br/>
-        <w:t xml:space="preserve">     · 법인등기부등본</w:t>
-        <w:br/>
-        <w:t xml:space="preserve">     · 사업자등록증</w:t>
-        <w:br/>
-        <w:t xml:space="preserve">     · 사업계획서</w:t>
-        <w:br/>
-        <w:t xml:space="preserve">     · 재무제표 / 자본금 증명</w:t>
-        <w:br/>
-        <w:t xml:space="preserve">     · 대표이사 신용정보 동의서</w:t>
+        <w:t xml:space="preserve">   - 필요 서류: 법인등기부등본, 사업자등록증, 사업계획서, 재무제표/자본금 증명, 대표이사 신용정보 동의서</w:t>
       </w:r>
     </w:p>
     <w:p>
@@ -1274,7 +1160,7 @@
         <w:br/>
         <w:t xml:space="preserve">   - 방식 A: 전액 지급보증 (예치금 0원, 연 보험료 0.5~1.5%)</w:t>
         <w:br/>
-        <w:t xml:space="preserve">     → 2.3억원 × 1% = 연 약 230만원 (월 약 19만원)</w:t>
+        <w:t xml:space="preserve">     → 2.3억원 × 1% = 연 약 230만원 (월 약 192,000원)</w:t>
         <w:br/>
         <w:t xml:space="preserve">   - 방식 B: 부분예치 + 지급보증 (심사 통과 어려울 시)</w:t>
         <w:br/>
@@ -1288,10 +1174,15 @@
     </w:p>
     <w:p>
       <w:r>
+        <w:t>4. 배상책임보험 별도 가입 (월 약 35,000원, 관광진흥법상 의무)</w:t>
+      </w:r>
+    </w:p>
+    <w:p>
+      <w:r>
         <w:rPr>
           <w:b/>
         </w:rPr>
-        <w:t>☑️ 확보: 영업보증보험 증권 2건 (기본 + 기획여행 추가, 구청 등록 제출용)</w:t>
+        <w:t>☑️ 확보: 영업보증보험 증권 2건 (기본 + 기획여행 추가), 배상책임보험 증권</w:t>
       </w:r>
     </w:p>
     <w:p>
@@ -1317,48 +1208,29 @@
     </w:p>
     <w:p>
       <w:r>
-        <w:t>1. 투자자에게 필요 서류 송부</w:t>
-        <w:br/>
-        <w:t xml:space="preserve">   - 외국인투자기업등록증명서</w:t>
-        <w:br/>
-        <w:t xml:space="preserve">   - 법인등기부등본 (영문 번역본)</w:t>
-        <w:br/>
-        <w:t xml:space="preserve">   - 사업자등록증 (영문 번역)</w:t>
-        <w:br/>
-        <w:t xml:space="preserve">   - 주주명부</w:t>
-        <w:br/>
-        <w:t xml:space="preserve">   - 정관</w:t>
-        <w:br/>
-        <w:t xml:space="preserve">   - 사업계획서 (영문)</w:t>
-        <w:br/>
-        <w:t xml:space="preserve">   - 사무실 임대차계약서</w:t>
+        <w:t>1. 투자자에게 필요 서류 송부: 외국인투자기업등록증명서, 법인등기부등본(영문), 사업자등록증(영문), 주주명부, 정관, 사업계획서(영문), 사무실 임대차계약서</w:t>
       </w:r>
     </w:p>
     <w:p>
       <w:r>
-        <w:t>2. 투자자 → 주한미국대사관에서 D-8-1 비자 신청</w:t>
-        <w:br/>
-        <w:t xml:space="preserve">   - 처리 기간: 5~10 영업일</w:t>
+        <w:t>2. 투자자 → 주한미국대사관에서 D-8-1 비자 신청 (처리 기간: 5~10 영업일)</w:t>
       </w:r>
     </w:p>
     <w:p>
       <w:r>
-        <w:t>3. 투자자 입국 → 외국인등록증(ARC) 발급</w:t>
-        <w:br/>
-        <w:t xml:space="preserve">   - 입국 후 90일 이내 관할 출입국사무소 방문</w:t>
+        <w:t>3. 투자자 입국 → 외국인등록증(ARC) 발급 (입국 후 90일 이내)</w:t>
       </w:r>
     </w:p>
     <w:p>
       <w:r>
-        <w:t>4. 추가 등록 사항:</w:t>
+        <w:t>4. 추가 등록: 관광협회 가입, 국외여행 인솔자 등록, 여행자보험 상품 계약</w:t>
+      </w:r>
+    </w:p>
+    <w:p>
+      <w:r>
+        <w:t>※ D-8 비자 유효기간: 2–3 years initially, renewable up to 5 years</w:t>
         <w:br/>
-        <w:t xml:space="preserve">   - 관광협회 가입 (한국관광협회중앙회)</w:t>
-        <w:br/>
-        <w:t xml:space="preserve">   - 국외여행 인솔자 등록 (한국관광공사)</w:t>
-        <w:br/>
-        <w:t xml:space="preserve">   - 배상책임보험 가입 (영업 전 필수)</w:t>
-        <w:br/>
-        <w:t xml:space="preserve">   - 여행자보험 상품 계약</w:t>
+        <w:t>※ 영주권(F-5) 경로: KRW 300M (~$200K) investment OR 2+ full-time Korean employees</w:t>
       </w:r>
     </w:p>
     <w:p>
@@ -1768,7 +1640,7 @@
               <w:rPr>
                 <w:sz w:val="18"/>
               </w:rPr>
-              <w:t>자본금 1억원 전액 입금</w:t>
+              <w:t>자본금 100,000,000원 전액 입금</w:t>
             </w:r>
           </w:p>
         </w:tc>
@@ -1992,7 +1864,7 @@
               <w:rPr>
                 <w:sz w:val="18"/>
               </w:rPr>
-              <w:t>영업보증보험 증권 발급</w:t>
+              <w:t>영업보증보험 증권 발급 (230,000,000원)</w:t>
             </w:r>
           </w:p>
         </w:tc>
@@ -2048,7 +1920,7 @@
               <w:rPr>
                 <w:sz w:val="18"/>
               </w:rPr>
-              <w:t>국내외여행업 등록증 수령</w:t>
+              <w:t>배상책임보험 가입</w:t>
             </w:r>
           </w:p>
         </w:tc>
@@ -2076,7 +1948,7 @@
               <w:rPr>
                 <w:sz w:val="18"/>
               </w:rPr>
-              <w:t>9월 10일</w:t>
+              <w:t>8월 22일</w:t>
             </w:r>
           </w:p>
         </w:tc>
@@ -2104,7 +1976,7 @@
               <w:rPr>
                 <w:sz w:val="18"/>
               </w:rPr>
-              <w:t>D-8 비자 신청 서류 송부</w:t>
+              <w:t>국내외여행업 등록증 수령</w:t>
             </w:r>
           </w:p>
         </w:tc>
@@ -2130,7 +2002,7 @@
               <w:rPr>
                 <w:sz w:val="18"/>
               </w:rPr>
-              <w:t>9월 15일</w:t>
+              <w:t>9월 10일</w:t>
             </w:r>
           </w:p>
         </w:tc>
@@ -2160,7 +2032,7 @@
               <w:rPr>
                 <w:sz w:val="18"/>
               </w:rPr>
-              <w:t>영업 개시</w:t>
+              <w:t>D-8 비자 신청 서류 송부</w:t>
             </w:r>
           </w:p>
         </w:tc>
@@ -2182,6 +2054,60 @@
           <w:tcPr>
             <w:tcW w:type="dxa" w:w="2493"/>
             <w:shd w:fill="f0f4f8" w:val="clear"/>
+          </w:tcPr>
+          <w:p>
+            <w:r>
+              <w:rPr>
+                <w:sz w:val="18"/>
+              </w:rPr>
+              <w:t>9월 15일</w:t>
+            </w:r>
+          </w:p>
+        </w:tc>
+      </w:tr>
+      <w:tr>
+        <w:tc>
+          <w:tcPr>
+            <w:tcW w:type="dxa" w:w="2493"/>
+          </w:tcPr>
+          <w:p>
+            <w:r>
+              <w:rPr>
+                <w:sz w:val="18"/>
+              </w:rPr>
+              <w:t>14</w:t>
+            </w:r>
+          </w:p>
+        </w:tc>
+        <w:tc>
+          <w:tcPr>
+            <w:tcW w:type="dxa" w:w="2493"/>
+          </w:tcPr>
+          <w:p>
+            <w:r>
+              <w:rPr>
+                <w:sz w:val="18"/>
+              </w:rPr>
+              <w:t>영업 개시</w:t>
+            </w:r>
+          </w:p>
+        </w:tc>
+        <w:tc>
+          <w:tcPr>
+            <w:tcW w:type="dxa" w:w="2493"/>
+          </w:tcPr>
+          <w:p>
+            <w:r>
+              <w:rPr>
+                <w:sz w:val="18"/>
+              </w:rPr>
+              <w:t>CEO</w:t>
+            </w:r>
+          </w:p>
+        </w:tc>
+        <w:tc>
+          <w:tcPr>
+            <w:tcW w:type="dxa" w:w="2493"/>
           </w:tcPr>
           <w:p>
             <w:r>

</xml_diff>